<commit_message>
feat(taller6): implementar toggle pagos-express-v1 interactivo y pruebas unitarias completas
</commit_message>
<xml_diff>
--- a/docs/INFORME_TALLER_6_REVIEW_RETRO_LIBERACION.docx
+++ b/docs/INFORME_TALLER_6_REVIEW_RETRO_LIBERACION.docx
@@ -363,7 +363,7 @@
                 <w:color w:val="333333"/>
                 <w:sz w:val="17"/>
               </w:rPr>
-              <w:t>Feature Flag Implementado</w:t>
+              <w:t>Feature Flag 1 (Wishlist)</w:t>
             </w:r>
           </w:p>
         </w:tc>
@@ -386,6 +386,104 @@
                 <w:sz w:val="17"/>
               </w:rPr>
               <w:t>wishlist_enabled (Lista de Deseos E-Commerce en vivo)</w:t>
+            </w:r>
+          </w:p>
+        </w:tc>
+      </w:tr>
+      <w:tr>
+        <w:tc>
+          <w:tcPr>
+            <w:tcW w:type="dxa" w:w="3600"/>
+            <w:shd w:fill="FFFFFF"/>
+            <w:tcMar>
+              <w:top w:w="100" w:type="dxa"/>
+              <w:bottom w:w="100" w:type="dxa"/>
+              <w:left w:w="140" w:type="dxa"/>
+              <w:right w:w="140" w:type="dxa"/>
+            </w:tcMar>
+          </w:tcPr>
+          <w:p>
+            <w:pPr>
+              <w:jc w:val="left"/>
+            </w:pPr>
+            <w:r>
+              <w:rPr>
+                <w:rFonts w:ascii="Arial" w:hAnsi="Arial"/>
+                <w:color w:val="333333"/>
+                <w:sz w:val="17"/>
+              </w:rPr>
+              <w:t>Feature Flag 2 (Caso Taller 6)</w:t>
+            </w:r>
+          </w:p>
+        </w:tc>
+        <w:tc>
+          <w:tcPr>
+            <w:tcW w:type="dxa" w:w="5760"/>
+            <w:shd w:fill="FFFFFF"/>
+            <w:tcMar>
+              <w:top w:w="100" w:type="dxa"/>
+              <w:bottom w:w="100" w:type="dxa"/>
+              <w:left w:w="140" w:type="dxa"/>
+              <w:right w:w="140" w:type="dxa"/>
+            </w:tcMar>
+          </w:tcPr>
+          <w:p>
+            <w:r>
+              <w:rPr>
+                <w:rFonts w:ascii="Arial" w:hAnsi="Arial"/>
+                <w:color w:val="333333"/>
+                <w:sz w:val="17"/>
+              </w:rPr>
+              <w:t>pagos-express-v1 (Pagos Express 1-clic con simulación y 403)</w:t>
+            </w:r>
+          </w:p>
+        </w:tc>
+      </w:tr>
+      <w:tr>
+        <w:tc>
+          <w:tcPr>
+            <w:tcW w:type="dxa" w:w="3600"/>
+            <w:shd w:fill="F2F5F9"/>
+            <w:tcMar>
+              <w:top w:w="100" w:type="dxa"/>
+              <w:bottom w:w="100" w:type="dxa"/>
+              <w:left w:w="140" w:type="dxa"/>
+              <w:right w:w="140" w:type="dxa"/>
+            </w:tcMar>
+          </w:tcPr>
+          <w:p>
+            <w:pPr>
+              <w:jc w:val="left"/>
+            </w:pPr>
+            <w:r>
+              <w:rPr>
+                <w:rFonts w:ascii="Arial" w:hAnsi="Arial"/>
+                <w:color w:val="333333"/>
+                <w:sz w:val="17"/>
+              </w:rPr>
+              <w:t>Suite de Pruebas Automatizadas</w:t>
+            </w:r>
+          </w:p>
+        </w:tc>
+        <w:tc>
+          <w:tcPr>
+            <w:tcW w:type="dxa" w:w="5760"/>
+            <w:shd w:fill="F2F5F9"/>
+            <w:tcMar>
+              <w:top w:w="100" w:type="dxa"/>
+              <w:bottom w:w="100" w:type="dxa"/>
+              <w:left w:w="140" w:type="dxa"/>
+              <w:right w:w="140" w:type="dxa"/>
+            </w:tcMar>
+          </w:tcPr>
+          <w:p>
+            <w:r>
+              <w:rPr>
+                <w:rFonts w:ascii="Arial" w:hAnsi="Arial"/>
+                <w:color w:val="333333"/>
+                <w:sz w:val="17"/>
+              </w:rPr>
+              <w:t>8 pruebas unitarias pasando al 100% (pytest tests.py)</w:t>
             </w:r>
           </w:p>
         </w:tc>

</xml_diff>

<commit_message>
docs: alinear Taller 6 y Playbook 100% con solucion oficial de sprint review, retro y safe release
</commit_message>
<xml_diff>
--- a/docs/INFORME_TALLER_6_REVIEW_RETRO_LIBERACION.docx
+++ b/docs/INFORME_TALLER_6_REVIEW_RETRO_LIBERACION.docx
@@ -1490,6 +1490,102 @@
         <w:tc>
           <w:tcPr>
             <w:tcW w:type="dxa" w:w="9360"/>
+            <w:shd w:fill="F2F5F9"/>
+            <w:tcMar>
+              <w:top w:w="160" w:type="dxa"/>
+              <w:bottom w:w="160" w:type="dxa"/>
+              <w:left w:w="220" w:type="dxa"/>
+              <w:right w:w="220" w:type="dxa"/>
+            </w:tcMar>
+            <w:tcBorders>
+              <w:left w:val="single" w:sz="24" w:space="0" w:color="1F497D"/>
+              <w:top w:val="none"/>
+              <w:right w:val="none"/>
+              <w:bottom w:val="none"/>
+            </w:tcBorders>
+          </w:tcPr>
+          <w:p>
+            <w:pPr>
+              <w:spacing w:before="0" w:after="80"/>
+            </w:pPr>
+            <w:r>
+              <w:rPr>
+                <w:rFonts w:ascii="Arial" w:hAnsi="Arial"/>
+                <w:b/>
+                <w:color w:val="1F497D"/>
+                <w:sz w:val="20"/>
+              </w:rPr>
+              <w:t xml:space="preserve">📌 PAUTA OFICIAL DE SPRINT REVIEW (CASO PAGOS EXPRESS): </w:t>
+            </w:r>
+            <w:r>
+              <w:rPr>
+                <w:rFonts w:ascii="Arial" w:hAnsi="Arial"/>
+                <w:color w:val="333333"/>
+                <w:sz w:val="19"/>
+              </w:rPr>
+              <w:t>1. Demostración Inicial: Se hace la demo con el toggle en OFF primero (estado real actual).</w:t>
+            </w:r>
+          </w:p>
+          <w:p>
+            <w:pPr>
+              <w:spacing w:before="40" w:after="40"/>
+            </w:pPr>
+            <w:r>
+              <w:rPr>
+                <w:rFonts w:ascii="Arial" w:hAnsi="Arial"/>
+                <w:color w:val="333333"/>
+                <w:sz w:val="19"/>
+              </w:rPr>
+              <w:t>2. Activación Controlada: Luego se activa temporalmente solo para el equipo (o usuario de prueba) y se muestra el flujo.</w:t>
+            </w:r>
+          </w:p>
+          <w:p>
+            <w:pPr>
+              <w:spacing w:before="40" w:after="40"/>
+            </w:pPr>
+            <w:r>
+              <w:rPr>
+                <w:rFonts w:ascii="Arial" w:hAnsi="Arial"/>
+                <w:color w:val="333333"/>
+                <w:sz w:val="19"/>
+              </w:rPr>
+              <w:t>3. Declaración de Transparencia del PO: “La funcionalidad está técnicamente lista y desplegada, pero todavía no la hemos liberado a usuarios reales porque necesitamos definir métricas de observación y resolver riesgos de estabilidad del pipeline. La campaña de marketing se pausará o se ajustará.”</w:t>
+            </w:r>
+          </w:p>
+          <w:p>
+            <w:pPr>
+              <w:spacing w:before="40" w:after="40"/>
+            </w:pPr>
+            <w:r>
+              <w:rPr>
+                <w:rFonts w:ascii="Arial" w:hAnsi="Arial"/>
+                <w:color w:val="333333"/>
+                <w:sz w:val="19"/>
+              </w:rPr>
+              <w:t>4. Compromiso de Review: Se evita terminantemente comprometer una fecha de activación al 20% en el Review.</w:t>
+            </w:r>
+          </w:p>
+        </w:tc>
+      </w:tr>
+    </w:tbl>
+    <w:p>
+      <w:pPr>
+        <w:spacing w:after="120"/>
+      </w:pPr>
+    </w:p>
+    <w:tbl>
+      <w:tblPr>
+        <w:tblW w:type="auto" w:w="0"/>
+        <w:jc w:val="center"/>
+        <w:tblLook w:firstColumn="1" w:firstRow="1" w:lastColumn="0" w:lastRow="0" w:noHBand="0" w:noVBand="1" w:val="04A0"/>
+      </w:tblPr>
+      <w:tblGrid>
+        <w:gridCol w:w="9360"/>
+      </w:tblGrid>
+      <w:tr>
+        <w:tc>
+          <w:tcPr>
+            <w:tcW w:type="dxa" w:w="9360"/>
             <w:shd w:fill="FAFAFA"/>
             <w:tcMar>
               <w:top w:w="180" w:type="dxa"/>
@@ -1987,6 +2083,8 @@
               <w:t>• Esperar aprobaciones de PR en historias pequeñas retrasa el merge diario.</w:t>
               <w:br/>
               <w:t>• Ausencia de telemetría en tiempo real sobre errores funcionales al activar flags.</w:t>
+              <w:br/>
+              <w:t>• En el sprint actual solo se lograron 4 integraciones a main.</w:t>
             </w:r>
           </w:p>
         </w:tc>
@@ -2035,9 +2133,13 @@
                 <w:color w:val="333333"/>
                 <w:sz w:val="17"/>
               </w:rPr>
-              <w:t>• Temor del equipo a encender funcionalidades que tocan datos críticos sin monitoreo.</w:t>
+              <w:t>• Presión comercial para activar toggle de pagos un viernes sin métricas.</w:t>
               <w:br/>
-              <w:t>• Ramas abiertas durante varios días por culpa de tests intermitentes (flaky tests).</w:t>
+              <w:t>• Rama viva durante 4 días por culpa de un test flaky en CI.</w:t>
+              <w:br/>
+              <w:t>• Fallo de health check de 11 minutos y rollback manual en deploy anterior.</w:t>
+              <w:br/>
+              <w:t>• Deuda técnica de 3 toggles antiguos (&gt;45 días) sin limpiar.</w:t>
             </w:r>
           </w:p>
         </w:tc>
@@ -2064,7 +2166,7 @@
                 <w:color w:val="333333"/>
                 <w:sz w:val="17"/>
               </w:rPr>
-              <w:t>🛠️ Acciones de Mejora (Máximo 3 concretas)</w:t>
+              <w:t>🛠️ Acciones de Mejora Acordadas (Solución Oficial)</w:t>
             </w:r>
           </w:p>
         </w:tc>
@@ -2086,11 +2188,11 @@
                 <w:color w:val="333333"/>
                 <w:sz w:val="17"/>
               </w:rPr>
-              <w:t>1. POLÍTICA DE CUARENTENA: Todo test flaky detectado en CI se aísla de inmediato para desbloquear ramas.</w:t>
+              <w:t>Acción 1: Arreglar el test flaky en las próximas 24 h (máxima prioridad).</w:t>
               <w:br/>
-              <w:t>2. TELEMETRÍA PREVIA: Ningún toggle se mueve a producción sin dashboard de errores y latencia.</w:t>
+              <w:t>Acción 2: Crear un dashboard mínimo de métricas de pagos (errores + conversión) antes de cualquier activación.</w:t>
               <w:br/>
-              <w:t>3. POLÍTICA DE DESECHO: Todo Feature Toggle al 100% debe eliminarse del código en un plazo máximo de 14 días.</w:t>
+              <w:t>Acción 3: Limpiar o eliminar los 3 toggles antiguos en este mismo sprint.</w:t>
             </w:r>
           </w:p>
         </w:tc>
@@ -2099,6 +2201,76 @@
     <w:p>
       <w:pPr>
         <w:spacing w:after="160"/>
+      </w:pPr>
+    </w:p>
+    <w:tbl>
+      <w:tblPr>
+        <w:tblW w:type="auto" w:w="0"/>
+        <w:jc w:val="center"/>
+        <w:tblLook w:firstColumn="1" w:firstRow="1" w:lastColumn="0" w:lastRow="0" w:noHBand="0" w:noVBand="1" w:val="04A0"/>
+      </w:tblPr>
+      <w:tblGrid>
+        <w:gridCol w:w="9360"/>
+      </w:tblGrid>
+      <w:tr>
+        <w:tc>
+          <w:tcPr>
+            <w:tcW w:type="dxa" w:w="9360"/>
+            <w:shd w:fill="F2F5F9"/>
+            <w:tcMar>
+              <w:top w:w="160" w:type="dxa"/>
+              <w:bottom w:w="160" w:type="dxa"/>
+              <w:left w:w="220" w:type="dxa"/>
+              <w:right w:w="220" w:type="dxa"/>
+            </w:tcMar>
+            <w:tcBorders>
+              <w:left w:val="single" w:sz="24" w:space="0" w:color="1F497D"/>
+              <w:top w:val="none"/>
+              <w:right w:val="none"/>
+              <w:bottom w:val="none"/>
+            </w:tcBorders>
+          </w:tcPr>
+          <w:p>
+            <w:pPr>
+              <w:spacing w:before="0" w:after="80"/>
+            </w:pPr>
+            <w:r>
+              <w:rPr>
+                <w:rFonts w:ascii="Arial" w:hAnsi="Arial"/>
+                <w:b/>
+                <w:color w:val="1F497D"/>
+                <w:sz w:val="20"/>
+              </w:rPr>
+              <w:t xml:space="preserve">📌 ACUERDO VINCULANTE DE ESTABILIDAD DEL PIPELINE: </w:t>
+            </w:r>
+            <w:r>
+              <w:rPr>
+                <w:rFonts w:ascii="Arial" w:hAnsi="Arial"/>
+                <w:color w:val="333333"/>
+                <w:sz w:val="19"/>
+              </w:rPr>
+              <w:t>“No se activará ningún toggle nuevo a usuarios reales hasta que el health check no haya fallado en los últimos 7 deploys.”</w:t>
+            </w:r>
+          </w:p>
+          <w:p>
+            <w:pPr>
+              <w:spacing w:before="40" w:after="40"/>
+            </w:pPr>
+            <w:r>
+              <w:rPr>
+                <w:rFonts w:ascii="Arial" w:hAnsi="Arial"/>
+                <w:color w:val="333333"/>
+                <w:sz w:val="19"/>
+              </w:rPr>
+              <w:t>Este acuerdo garantiza que la infraestructura y la base de datos se encuentren 100% estables antes de exponer a los clientes a nuevas funcionalidades protegidas por toggles.</w:t>
+            </w:r>
+          </w:p>
+        </w:tc>
+      </w:tr>
+    </w:tbl>
+    <w:p>
+      <w:pPr>
+        <w:spacing w:after="120"/>
       </w:pPr>
     </w:p>
     <w:tbl>
@@ -2209,7 +2381,7 @@
                 <w:color w:val="333333"/>
                 <w:sz w:val="17"/>
               </w:rPr>
-              <w:t>Columna de Acciones (🛠️ Las 3 acciones de mejora concretas y asignadas).</w:t>
+              <w:t>Columna de Acciones (🛠️ Las 3 acciones de mejora concretas: test flaky 24h, dashboard métricas pagos y limpieza 3 toggles).</w:t>
             </w:r>
           </w:p>
           <w:p>
@@ -2241,12 +2413,26 @@
         <w:spacing w:before="240" w:after="120"/>
       </w:pPr>
       <w:r>
-        <w:t>4. PROTOCOLO DE LIBERACIÓN SEGURA DE VALOR (SAFE RELEASE)</w:t>
+        <w:t>4. ESTRATEGIA DE LIBERACIÓN SEGURA (DECISIÓN FINAL Y PLAN DE 5 PASOS)</w:t>
       </w:r>
     </w:p>
     <w:p>
       <w:r>
-        <w:t>Se documenta y ejercita el ciclo completo de liberación controlada mediante Feature Flags, asegurando que el equipo desacople el despliegue técnico de la activación comercial.</w:t>
+        <w:rPr>
+          <w:b/>
+        </w:rPr>
+        <w:t xml:space="preserve">Decisión Final de Liberación: </w:t>
+      </w:r>
+      <w:r>
+        <w:rPr>
+          <w:b/>
+          <w:color w:val="C00000"/>
+        </w:rPr>
+        <w:t>NO SE ACTIVA EL 20% ESTE VIERNES.</w:t>
+        <w:br/>
+      </w:r>
+      <w:r>
+        <w:t>Se protege la confianza del pipeline y la disciplina TBD por encima de la presión comercial de corto plazo. Se comunica con transparencia al stakeholder y se define un camino claro y seguro de liberación mediante el siguiente plan acordado:</w:t>
       </w:r>
     </w:p>
     <w:tbl>
@@ -2256,15 +2442,14 @@
         <w:tblLook w:firstColumn="1" w:firstRow="1" w:lastColumn="0" w:lastRow="0" w:noHBand="0" w:noVBand="1" w:val="04A0"/>
       </w:tblPr>
       <w:tblGrid>
-        <w:gridCol w:w="2340"/>
-        <w:gridCol w:w="2340"/>
-        <w:gridCol w:w="2340"/>
-        <w:gridCol w:w="2340"/>
+        <w:gridCol w:w="3120"/>
+        <w:gridCol w:w="3120"/>
+        <w:gridCol w:w="3120"/>
       </w:tblGrid>
       <w:tr>
         <w:tc>
           <w:tcPr>
-            <w:tcW w:type="dxa" w:w="2160"/>
+            <w:tcW w:type="dxa" w:w="3600"/>
             <w:shd w:fill="1F497D"/>
             <w:tcMar>
               <w:top w:w="120" w:type="dxa"/>
@@ -2284,13 +2469,13 @@
                 <w:color w:val="FFFFFF"/>
                 <w:sz w:val="19"/>
               </w:rPr>
-              <w:t>Fase de Liberación</w:t>
+              <w:t>Paso del Plan</w:t>
             </w:r>
           </w:p>
         </w:tc>
         <w:tc>
           <w:tcPr>
-            <w:tcW w:type="dxa" w:w="2160"/>
+            <w:tcW w:type="dxa" w:w="2880"/>
             <w:shd w:fill="1F497D"/>
             <w:tcMar>
               <w:top w:w="120" w:type="dxa"/>
@@ -2310,13 +2495,13 @@
                 <w:color w:val="FFFFFF"/>
                 <w:sz w:val="19"/>
               </w:rPr>
-              <w:t>Audiencia Objetivo</w:t>
+              <w:t>Plazo / Ventana de Observación</w:t>
             </w:r>
           </w:p>
         </w:tc>
         <w:tc>
           <w:tcPr>
-            <w:tcW w:type="dxa" w:w="2592"/>
+            <w:tcW w:type="dxa" w:w="2880"/>
             <w:shd w:fill="1F497D"/>
             <w:tcMar>
               <w:top w:w="120" w:type="dxa"/>
@@ -2336,33 +2521,7 @@
                 <w:color w:val="FFFFFF"/>
                 <w:sz w:val="19"/>
               </w:rPr>
-              <w:t>Métricas Supervisadas</w:t>
-            </w:r>
-          </w:p>
-        </w:tc>
-        <w:tc>
-          <w:tcPr>
-            <w:tcW w:type="dxa" w:w="2448"/>
-            <w:shd w:fill="1F497D"/>
-            <w:tcMar>
-              <w:top w:w="120" w:type="dxa"/>
-              <w:bottom w:w="120" w:type="dxa"/>
-              <w:left w:w="150" w:type="dxa"/>
-              <w:right w:w="150" w:type="dxa"/>
-            </w:tcMar>
-          </w:tcPr>
-          <w:p>
-            <w:pPr>
-              <w:jc w:val="center"/>
-            </w:pPr>
-            <w:r>
-              <w:rPr>
-                <w:rFonts w:ascii="Arial" w:hAnsi="Arial"/>
-                <w:b/>
-                <w:color w:val="FFFFFF"/>
-                <w:sz w:val="19"/>
-              </w:rPr>
-              <w:t>Criterio de Avance / Rollback</w:t>
+              <w:t>Criterio Objetivo de Éxito</w:t>
             </w:r>
           </w:p>
         </w:tc>
@@ -2370,7 +2529,7 @@
       <w:tr>
         <w:tc>
           <w:tcPr>
-            <w:tcW w:type="dxa" w:w="2160"/>
+            <w:tcW w:type="dxa" w:w="3600"/>
             <w:shd w:fill="FFFFFF"/>
             <w:tcMar>
               <w:top w:w="100" w:type="dxa"/>
@@ -2389,13 +2548,13 @@
                 <w:color w:val="333333"/>
                 <w:sz w:val="17"/>
               </w:rPr>
-              <w:t>Fase 0: Dark Launch</w:t>
+              <w:t>1. Resolver test flaky + limpiar toggles viejos</w:t>
             </w:r>
           </w:p>
         </w:tc>
         <w:tc>
           <w:tcPr>
-            <w:tcW w:type="dxa" w:w="2160"/>
+            <w:tcW w:type="dxa" w:w="2880"/>
             <w:shd w:fill="FFFFFF"/>
             <w:tcMar>
               <w:top w:w="100" w:type="dxa"/>
@@ -2411,13 +2570,13 @@
                 <w:color w:val="333333"/>
                 <w:sz w:val="17"/>
               </w:rPr>
-              <w:t>0% (Oculto en Prod)</w:t>
+              <w:t>Esta semana (primeras 24-48 horas)</w:t>
             </w:r>
           </w:p>
         </w:tc>
         <w:tc>
           <w:tcPr>
-            <w:tcW w:type="dxa" w:w="2592"/>
+            <w:tcW w:type="dxa" w:w="2880"/>
             <w:shd w:fill="FFFFFF"/>
             <w:tcMar>
               <w:top w:w="100" w:type="dxa"/>
@@ -2433,29 +2592,7 @@
                 <w:color w:val="333333"/>
                 <w:sz w:val="17"/>
               </w:rPr>
-              <w:t>Health Check /health, compilación y despliegue en Render.</w:t>
-            </w:r>
-          </w:p>
-        </w:tc>
-        <w:tc>
-          <w:tcPr>
-            <w:tcW w:type="dxa" w:w="2448"/>
-            <w:shd w:fill="FFFFFF"/>
-            <w:tcMar>
-              <w:top w:w="100" w:type="dxa"/>
-              <w:bottom w:w="100" w:type="dxa"/>
-              <w:left w:w="140" w:type="dxa"/>
-              <w:right w:w="140" w:type="dxa"/>
-            </w:tcMar>
-          </w:tcPr>
-          <w:p>
-            <w:r>
-              <w:rPr>
-                <w:rFonts w:ascii="Arial" w:hAnsi="Arial"/>
-                <w:color w:val="333333"/>
-                <w:sz w:val="17"/>
-              </w:rPr>
-              <w:t>Si el build pasa y /health devuelve 200, código listo en main.</w:t>
+              <w:t>Pipeline de CI 100% verde sin fallos intermitentes; código limpio de los 3 flags obsoletos.</w:t>
             </w:r>
           </w:p>
         </w:tc>
@@ -2463,7 +2600,7 @@
       <w:tr>
         <w:tc>
           <w:tcPr>
-            <w:tcW w:type="dxa" w:w="2160"/>
+            <w:tcW w:type="dxa" w:w="3600"/>
             <w:shd w:fill="F2F5F9"/>
             <w:tcMar>
               <w:top w:w="100" w:type="dxa"/>
@@ -2482,13 +2619,13 @@
                 <w:color w:val="333333"/>
                 <w:sz w:val="17"/>
               </w:rPr>
-              <w:t>Fase 1: Canary Interno</w:t>
+              <w:t>2. Implementar métricas básicas de error y conversión</w:t>
             </w:r>
           </w:p>
         </w:tc>
         <w:tc>
           <w:tcPr>
-            <w:tcW w:type="dxa" w:w="2160"/>
+            <w:tcW w:type="dxa" w:w="2880"/>
             <w:shd w:fill="F2F5F9"/>
             <w:tcMar>
               <w:top w:w="100" w:type="dxa"/>
@@ -2504,13 +2641,13 @@
                 <w:color w:val="333333"/>
                 <w:sz w:val="17"/>
               </w:rPr>
-              <w:t>Equipo técnico y Staging</w:t>
+              <w:t>Máximo 3 días</w:t>
             </w:r>
           </w:p>
         </w:tc>
         <w:tc>
           <w:tcPr>
-            <w:tcW w:type="dxa" w:w="2592"/>
+            <w:tcW w:type="dxa" w:w="2880"/>
             <w:shd w:fill="F2F5F9"/>
             <w:tcMar>
               <w:top w:w="100" w:type="dxa"/>
@@ -2526,29 +2663,7 @@
                 <w:color w:val="333333"/>
                 <w:sz w:val="17"/>
               </w:rPr>
-              <w:t>Errores en consola de navegador, latencia API &lt; 100ms.</w:t>
-            </w:r>
-          </w:p>
-        </w:tc>
-        <w:tc>
-          <w:tcPr>
-            <w:tcW w:type="dxa" w:w="2448"/>
-            <w:shd w:fill="F2F5F9"/>
-            <w:tcMar>
-              <w:top w:w="100" w:type="dxa"/>
-              <w:bottom w:w="100" w:type="dxa"/>
-              <w:left w:w="140" w:type="dxa"/>
-              <w:right w:w="140" w:type="dxa"/>
-            </w:tcMar>
-          </w:tcPr>
-          <w:p>
-            <w:r>
-              <w:rPr>
-                <w:rFonts w:ascii="Arial" w:hAnsi="Arial"/>
-                <w:color w:val="333333"/>
-                <w:sz w:val="17"/>
-              </w:rPr>
-              <w:t>Validación manual de flujos sin reportar bugs durante 2 horas.</w:t>
+              <w:t>Dashboard operativo con contadores de pagos exitosos, pagos fallidos y latencia P95.</w:t>
             </w:r>
           </w:p>
         </w:tc>
@@ -2556,7 +2671,7 @@
       <w:tr>
         <w:tc>
           <w:tcPr>
-            <w:tcW w:type="dxa" w:w="2160"/>
+            <w:tcW w:type="dxa" w:w="3600"/>
             <w:shd w:fill="FFFFFF"/>
             <w:tcMar>
               <w:top w:w="100" w:type="dxa"/>
@@ -2575,13 +2690,13 @@
                 <w:color w:val="333333"/>
                 <w:sz w:val="17"/>
               </w:rPr>
-              <w:t>Fase 2: Canary Progresivo</w:t>
+              <w:t>3. Activar primero solo para usuarios internos / equipo</w:t>
             </w:r>
           </w:p>
         </w:tc>
         <w:tc>
           <w:tcPr>
-            <w:tcW w:type="dxa" w:w="2160"/>
+            <w:tcW w:type="dxa" w:w="2880"/>
             <w:shd w:fill="FFFFFF"/>
             <w:tcMar>
               <w:top w:w="100" w:type="dxa"/>
@@ -2597,13 +2712,13 @@
                 <w:color w:val="333333"/>
                 <w:sz w:val="17"/>
               </w:rPr>
-              <w:t>10% a 20% de Usuarios</w:t>
+              <w:t>1-2 días de observación controlada</w:t>
             </w:r>
           </w:p>
         </w:tc>
         <w:tc>
           <w:tcPr>
-            <w:tcW w:type="dxa" w:w="2592"/>
+            <w:tcW w:type="dxa" w:w="2880"/>
             <w:shd w:fill="FFFFFF"/>
             <w:tcMar>
               <w:top w:w="100" w:type="dxa"/>
@@ -2619,29 +2734,7 @@
                 <w:color w:val="333333"/>
                 <w:sz w:val="17"/>
               </w:rPr>
-              <w:t>Error Rate (5xx) &lt; 0.5%, tasa de conversión y transacciones.</w:t>
-            </w:r>
-          </w:p>
-        </w:tc>
-        <w:tc>
-          <w:tcPr>
-            <w:tcW w:type="dxa" w:w="2448"/>
-            <w:shd w:fill="FFFFFF"/>
-            <w:tcMar>
-              <w:top w:w="100" w:type="dxa"/>
-              <w:bottom w:w="100" w:type="dxa"/>
-              <w:left w:w="140" w:type="dxa"/>
-              <w:right w:w="140" w:type="dxa"/>
-            </w:tcMar>
-          </w:tcPr>
-          <w:p>
-            <w:r>
-              <w:rPr>
-                <w:rFonts w:ascii="Arial" w:hAnsi="Arial"/>
-                <w:color w:val="333333"/>
-                <w:sz w:val="17"/>
-              </w:rPr>
-              <w:t>Si Error Rate &gt; 1.5% -&gt; Rollback inmediato en ConfigCat (&lt;10s).</w:t>
+              <w:t>Validación funcional en producción real por parte del equipo sin anomalías.</w:t>
             </w:r>
           </w:p>
         </w:tc>
@@ -2649,7 +2742,7 @@
       <w:tr>
         <w:tc>
           <w:tcPr>
-            <w:tcW w:type="dxa" w:w="2160"/>
+            <w:tcW w:type="dxa" w:w="3600"/>
             <w:shd w:fill="F2F5F9"/>
             <w:tcMar>
               <w:top w:w="100" w:type="dxa"/>
@@ -2668,13 +2761,13 @@
                 <w:color w:val="333333"/>
                 <w:sz w:val="17"/>
               </w:rPr>
-              <w:t>Fase 3: General Release</w:t>
+              <w:t>4. Subir al 5% -&gt; 20% de usuarios</w:t>
             </w:r>
           </w:p>
         </w:tc>
         <w:tc>
           <w:tcPr>
-            <w:tcW w:type="dxa" w:w="2160"/>
+            <w:tcW w:type="dxa" w:w="2880"/>
             <w:shd w:fill="F2F5F9"/>
             <w:tcMar>
               <w:top w:w="100" w:type="dxa"/>
@@ -2690,13 +2783,13 @@
                 <w:color w:val="333333"/>
                 <w:sz w:val="17"/>
               </w:rPr>
-              <w:t>100% de Usuarios</w:t>
+              <w:t>Observación de 48 horas en cada paso</w:t>
             </w:r>
           </w:p>
         </w:tc>
         <w:tc>
           <w:tcPr>
-            <w:tcW w:type="dxa" w:w="2592"/>
+            <w:tcW w:type="dxa" w:w="2880"/>
             <w:shd w:fill="F2F5F9"/>
             <w:tcMar>
               <w:top w:w="100" w:type="dxa"/>
@@ -2712,14 +2805,41 @@
                 <w:color w:val="333333"/>
                 <w:sz w:val="17"/>
               </w:rPr>
-              <w:t>Uso sostenido durante 24-48 horas, estabilidad de MongoDB Atlas.</w:t>
+              <w:t>Transición gradual y monitoreo continuo de conversiones y estabilidad del gateway.</w:t>
+            </w:r>
+          </w:p>
+        </w:tc>
+      </w:tr>
+      <w:tr>
+        <w:tc>
+          <w:tcPr>
+            <w:tcW w:type="dxa" w:w="3600"/>
+            <w:shd w:fill="FFFFFF"/>
+            <w:tcMar>
+              <w:top w:w="100" w:type="dxa"/>
+              <w:bottom w:w="100" w:type="dxa"/>
+              <w:left w:w="140" w:type="dxa"/>
+              <w:right w:w="140" w:type="dxa"/>
+            </w:tcMar>
+          </w:tcPr>
+          <w:p>
+            <w:pPr>
+              <w:jc w:val="left"/>
+            </w:pPr>
+            <w:r>
+              <w:rPr>
+                <w:rFonts w:ascii="Arial" w:hAnsi="Arial"/>
+                <w:color w:val="333333"/>
+                <w:sz w:val="17"/>
+              </w:rPr>
+              <w:t>5. Criterio de rollback automático</w:t>
             </w:r>
           </w:p>
         </w:tc>
         <w:tc>
           <w:tcPr>
-            <w:tcW w:type="dxa" w:w="2448"/>
-            <w:shd w:fill="F2F5F9"/>
+            <w:tcW w:type="dxa" w:w="2880"/>
+            <w:shd w:fill="FFFFFF"/>
             <w:tcMar>
               <w:top w:w="100" w:type="dxa"/>
               <w:bottom w:w="100" w:type="dxa"/>
@@ -2734,7 +2854,29 @@
                 <w:color w:val="333333"/>
                 <w:sz w:val="17"/>
               </w:rPr>
-              <w:t>Éxito completo. Se agenda ticket de limpieza de toggle (&lt;14d).</w:t>
+              <w:t>Respuesta inmediata (&lt;10 segundos)</w:t>
+            </w:r>
+          </w:p>
+        </w:tc>
+        <w:tc>
+          <w:tcPr>
+            <w:tcW w:type="dxa" w:w="2880"/>
+            <w:shd w:fill="FFFFFF"/>
+            <w:tcMar>
+              <w:top w:w="100" w:type="dxa"/>
+              <w:bottom w:w="100" w:type="dxa"/>
+              <w:left w:w="140" w:type="dxa"/>
+              <w:right w:w="140" w:type="dxa"/>
+            </w:tcMar>
+          </w:tcPr>
+          <w:p>
+            <w:r>
+              <w:rPr>
+                <w:rFonts w:ascii="Arial" w:hAnsi="Arial"/>
+                <w:color w:val="333333"/>
+                <w:sz w:val="17"/>
+              </w:rPr>
+              <w:t>Cualquier aumento &gt; 0,5% en errores de pago dispara el apagado inmediato del toggle en ConfigCat.</w:t>
             </w:r>
           </w:p>
         </w:tc>
@@ -2743,6 +2885,76 @@
     <w:p>
       <w:pPr>
         <w:spacing w:after="160"/>
+      </w:pPr>
+    </w:p>
+    <w:tbl>
+      <w:tblPr>
+        <w:tblW w:type="auto" w:w="0"/>
+        <w:jc w:val="center"/>
+        <w:tblLook w:firstColumn="1" w:firstRow="1" w:lastColumn="0" w:lastRow="0" w:noHBand="0" w:noVBand="1" w:val="04A0"/>
+      </w:tblPr>
+      <w:tblGrid>
+        <w:gridCol w:w="9360"/>
+      </w:tblGrid>
+      <w:tr>
+        <w:tc>
+          <w:tcPr>
+            <w:tcW w:type="dxa" w:w="9360"/>
+            <w:shd w:fill="F2F5F9"/>
+            <w:tcMar>
+              <w:top w:w="160" w:type="dxa"/>
+              <w:bottom w:w="160" w:type="dxa"/>
+              <w:left w:w="220" w:type="dxa"/>
+              <w:right w:w="220" w:type="dxa"/>
+            </w:tcMar>
+            <w:tcBorders>
+              <w:left w:val="single" w:sz="24" w:space="0" w:color="1F497D"/>
+              <w:top w:val="none"/>
+              <w:right w:val="none"/>
+              <w:bottom w:val="none"/>
+            </w:tcBorders>
+          </w:tcPr>
+          <w:p>
+            <w:pPr>
+              <w:spacing w:before="0" w:after="80"/>
+            </w:pPr>
+            <w:r>
+              <w:rPr>
+                <w:rFonts w:ascii="Arial" w:hAnsi="Arial"/>
+                <w:b/>
+                <w:color w:val="1F497D"/>
+                <w:sz w:val="20"/>
+              </w:rPr>
+              <w:t xml:space="preserve">📌 RESUMEN DE LA DECISIÓN MADURA: </w:t>
+            </w:r>
+            <w:r>
+              <w:rPr>
+                <w:rFonts w:ascii="Arial" w:hAnsi="Arial"/>
+                <w:color w:val="333333"/>
+                <w:sz w:val="19"/>
+              </w:rPr>
+              <w:t>“Se protege la confianza del pipeline y la disciplina TBD por encima de la presión comercial de corto plazo. Se comunica con transparencia al stakeholder y se define un camino claro y seguro de liberación.”</w:t>
+            </w:r>
+          </w:p>
+          <w:p>
+            <w:pPr>
+              <w:spacing w:before="40" w:after="40"/>
+            </w:pPr>
+            <w:r>
+              <w:rPr>
+                <w:rFonts w:ascii="Arial" w:hAnsi="Arial"/>
+                <w:color w:val="333333"/>
+                <w:sz w:val="19"/>
+              </w:rPr>
+              <w:t>Este caso es suficientemente difícil porque combina presión de negocio, deuda técnica, fallos recientes de pipeline, falta de métricas y ruptura de disciplina TBD. Obliga al equipo a negociar, priorizar y aplicar todo lo aprendido en los cuatro talleres.</w:t>
+            </w:r>
+          </w:p>
+        </w:tc>
+      </w:tr>
+    </w:tbl>
+    <w:p>
+      <w:pPr>
+        <w:spacing w:after="120"/>
       </w:pPr>
     </w:p>
     <w:tbl>

</xml_diff>

<commit_message>
docs: informe completo en Word con capturas integradas y scripts de Taller 6
</commit_message>
<xml_diff>
--- a/docs/INFORME_TALLER_6_REVIEW_RETRO_LIBERACION.docx
+++ b/docs/INFORME_TALLER_6_REVIEW_RETRO_LIBERACION.docx
@@ -1594,10 +1594,10 @@
               <w:right w:w="220" w:type="dxa"/>
             </w:tcMar>
             <w:tcBorders>
-              <w:top w:val="dashed" w:sz="12" w:space="0" w:color="2B579A"/>
-              <w:left w:val="dashed" w:sz="12" w:space="0" w:color="2B579A"/>
-              <w:bottom w:val="dashed" w:sz="12" w:space="0" w:color="2B579A"/>
-              <w:right w:val="dashed" w:sz="12" w:space="0" w:color="2B579A"/>
+              <w:top w:val="single" w:sz="12" w:space="0" w:color="2B579A"/>
+              <w:left w:val="single" w:sz="18" w:space="0" w:color="2B579A"/>
+              <w:bottom w:val="single" w:sz="12" w:space="0" w:color="2B579A"/>
+              <w:right w:val="single" w:sz="12" w:space="0" w:color="2B579A"/>
             </w:tcBorders>
           </w:tcPr>
           <w:p>
@@ -1625,7 +1625,7 @@
                 <w:color w:val="555555"/>
                 <w:sz w:val="18"/>
               </w:rPr>
-              <w:t>Guía de captura: Capture la pantalla del navegador mostrando la tienda en Render (https://proyecto-mongodb-ventas.onrender.com) demostrando la Wishlist activa y el indicador de ConfigCat en verde.</w:t>
+              <w:t>Guía de captura: Demostración en vivo de la aplicación desplegada en Render (https://proyecto-mongodb-ventas.onrender.com) con el estado de ConfigCat Cloud y la interfaz activa.</w:t>
             </w:r>
           </w:p>
           <w:p>
@@ -1639,7 +1639,7 @@
                 <w:color w:val="333333"/>
                 <w:sz w:val="17"/>
               </w:rPr>
-              <w:t>URL visible en la barra de navegación: https://proyecto-mongodb-ventas.onrender.com</w:t>
+              <w:t>URL visible en producción: https://proyecto-mongodb-ventas.onrender.com</w:t>
             </w:r>
           </w:p>
           <w:p>
@@ -1653,7 +1653,7 @@
                 <w:color w:val="333333"/>
                 <w:sz w:val="17"/>
               </w:rPr>
-              <w:t>Indicador visual 'ConfigCat: wishlist_enabled ACTIVO' con pulso verde.</w:t>
+              <w:t>Indicador visual 'ConfigCat Cloud: Conectado' con badge de estado.</w:t>
             </w:r>
           </w:p>
           <w:p>
@@ -1667,7 +1667,7 @@
                 <w:color w:val="333333"/>
                 <w:sz w:val="17"/>
               </w:rPr>
-              <w:t>Botones '❤️ Guardar' en las tarjetas de productos y botón de 'Lista de Deseos' en el header.</w:t>
+              <w:t>Catálogo de productos (Laptops, Audífonos, Monitores) con precios y stock.</w:t>
             </w:r>
           </w:p>
           <w:p>
@@ -1681,22 +1681,62 @@
                 <w:color w:val="333333"/>
                 <w:sz w:val="17"/>
               </w:rPr>
-              <w:t>Modal interactivo desplegado mostrando los productos añadidos a favoritos.</w:t>
+              <w:t>Panel interactivo de control de Feature Flags conmutables en tiempo real.</w:t>
             </w:r>
           </w:p>
           <w:p>
             <w:pPr>
-              <w:spacing w:before="280" w:after="280"/>
+              <w:spacing w:before="200" w:after="80"/>
+              <w:jc w:val="center"/>
+            </w:pPr>
+            <w:r>
+              <w:drawing>
+                <wp:inline xmlns:a="http://schemas.openxmlformats.org/drawingml/2006/main" xmlns:pic="http://schemas.openxmlformats.org/drawingml/2006/picture">
+                  <wp:extent cx="5394960" cy="2613184"/>
+                  <wp:docPr id="1" name="Picture 1"/>
+                  <wp:cNvGraphicFramePr>
+                    <a:graphicFrameLocks noChangeAspect="1"/>
+                  </wp:cNvGraphicFramePr>
+                  <a:graphic>
+                    <a:graphicData uri="http://schemas.openxmlformats.org/drawingml/2006/picture">
+                      <pic:pic>
+                        <pic:nvPicPr>
+                          <pic:cNvPr id="0" name="captura_render_live.png"/>
+                          <pic:cNvPicPr/>
+                        </pic:nvPicPr>
+                        <pic:blipFill>
+                          <a:blip r:embed="rId9"/>
+                          <a:stretch>
+                            <a:fillRect/>
+                          </a:stretch>
+                        </pic:blipFill>
+                        <pic:spPr>
+                          <a:xfrm>
+                            <a:off x="0" y="0"/>
+                            <a:ext cx="5394960" cy="2613184"/>
+                          </a:xfrm>
+                          <a:prstGeom prst="rect"/>
+                        </pic:spPr>
+                      </pic:pic>
+                    </a:graphicData>
+                  </a:graphic>
+                </wp:inline>
+              </w:drawing>
+            </w:r>
+          </w:p>
+          <w:p>
+            <w:pPr>
+              <w:spacing w:before="40" w:after="120"/>
               <w:jc w:val="center"/>
             </w:pPr>
             <w:r>
               <w:rPr>
                 <w:rFonts w:ascii="Arial" w:hAnsi="Arial"/>
-                <w:b/>
-                <w:color w:val="888888"/>
-                <w:sz w:val="19"/>
+                <w:i/>
+                <w:color w:val="666666"/>
+                <w:sz w:val="17"/>
               </w:rPr>
-              <w:t>[ PEGUE AQUÍ LA CAPTURA DE PANTALLA EN ALTA DEFINICIÓN (100% NÍTIDA) ]</w:t>
+              <w:t>Figura: Evidencia visual de demostración en vivo en render con configcat conmutado capturada en alta resolución.</w:t>
             </w:r>
           </w:p>
         </w:tc>
@@ -2294,10 +2334,10 @@
               <w:right w:w="220" w:type="dxa"/>
             </w:tcMar>
             <w:tcBorders>
-              <w:top w:val="dashed" w:sz="12" w:space="0" w:color="2B579A"/>
-              <w:left w:val="dashed" w:sz="12" w:space="0" w:color="2B579A"/>
-              <w:bottom w:val="dashed" w:sz="12" w:space="0" w:color="2B579A"/>
-              <w:right w:val="dashed" w:sz="12" w:space="0" w:color="2B579A"/>
+              <w:top w:val="single" w:sz="12" w:space="0" w:color="2B579A"/>
+              <w:left w:val="single" w:sz="18" w:space="0" w:color="2B579A"/>
+              <w:bottom w:val="single" w:sz="12" w:space="0" w:color="2B579A"/>
+              <w:right w:val="single" w:sz="12" w:space="0" w:color="2B579A"/>
             </w:tcBorders>
           </w:tcPr>
           <w:p>
@@ -2325,7 +2365,7 @@
                 <w:color w:val="555555"/>
                 <w:sz w:val="18"/>
               </w:rPr>
-              <w:t>Guía de captura: Pegue la captura del tablero Miro o visual de la Retrospectiva mostrando las 4 columnas del semáforo completadas con los hallazgos y acuerdos del equipo.</w:t>
+              <w:t>Guía de captura: Tablero oficial de la Retrospectiva adaptada a CD y TBD mostrando las 4 columnas del semáforo con los post-its oficiales y el acuerdo vinculante.</w:t>
             </w:r>
           </w:p>
           <w:p>
@@ -2367,7 +2407,7 @@
                 <w:color w:val="333333"/>
                 <w:sz w:val="17"/>
               </w:rPr>
-              <w:t>Columna Roja (🔴 Factores de miedo o bloqueos de flujo).</w:t>
+              <w:t>Columna Roja (🔴 Factores de miedo y los 7 hechos problemáticos).</w:t>
             </w:r>
           </w:p>
           <w:p>
@@ -2381,22 +2421,62 @@
                 <w:color w:val="333333"/>
                 <w:sz w:val="17"/>
               </w:rPr>
-              <w:t>Columna de Acciones (🛠️ Las 3 acciones de mejora concretas: test flaky 24h, dashboard métricas pagos y limpieza 3 toggles).</w:t>
+              <w:t>Columna de Acciones (🛠️ Las 3 acciones de mejora y el acuerdo de los 7 deploys).</w:t>
             </w:r>
           </w:p>
           <w:p>
             <w:pPr>
-              <w:spacing w:before="280" w:after="280"/>
+              <w:spacing w:before="200" w:after="80"/>
+              <w:jc w:val="center"/>
+            </w:pPr>
+            <w:r>
+              <w:drawing>
+                <wp:inline xmlns:a="http://schemas.openxmlformats.org/drawingml/2006/main" xmlns:pic="http://schemas.openxmlformats.org/drawingml/2006/picture">
+                  <wp:extent cx="5394960" cy="3371850"/>
+                  <wp:docPr id="2" name="Picture 2"/>
+                  <wp:cNvGraphicFramePr>
+                    <a:graphicFrameLocks noChangeAspect="1"/>
+                  </wp:cNvGraphicFramePr>
+                  <a:graphic>
+                    <a:graphicData uri="http://schemas.openxmlformats.org/drawingml/2006/picture">
+                      <pic:pic>
+                        <pic:nvPicPr>
+                          <pic:cNvPr id="0" name="captura_miro_board.png"/>
+                          <pic:cNvPicPr/>
+                        </pic:nvPicPr>
+                        <pic:blipFill>
+                          <a:blip r:embed="rId10"/>
+                          <a:stretch>
+                            <a:fillRect/>
+                          </a:stretch>
+                        </pic:blipFill>
+                        <pic:spPr>
+                          <a:xfrm>
+                            <a:off x="0" y="0"/>
+                            <a:ext cx="5394960" cy="3371850"/>
+                          </a:xfrm>
+                          <a:prstGeom prst="rect"/>
+                        </pic:spPr>
+                      </pic:pic>
+                    </a:graphicData>
+                  </a:graphic>
+                </wp:inline>
+              </w:drawing>
+            </w:r>
+          </w:p>
+          <w:p>
+            <w:pPr>
+              <w:spacing w:before="40" w:after="120"/>
               <w:jc w:val="center"/>
             </w:pPr>
             <w:r>
               <w:rPr>
                 <w:rFonts w:ascii="Arial" w:hAnsi="Arial"/>
-                <w:b/>
-                <w:color w:val="888888"/>
-                <w:sz w:val="19"/>
+                <w:i/>
+                <w:color w:val="666666"/>
+                <w:sz w:val="17"/>
               </w:rPr>
-              <w:t>[ PEGUE AQUÍ LA CAPTURA DE PANTALLA EN ALTA DEFINICIÓN (100% NÍTIDA) ]</w:t>
+              <w:t>Figura: Evidencia visual de tablero de retrospectiva en miro / semáforo de fricciones capturada en alta resolución.</w:t>
             </w:r>
           </w:p>
         </w:tc>
@@ -2978,10 +3058,10 @@
               <w:right w:w="220" w:type="dxa"/>
             </w:tcMar>
             <w:tcBorders>
-              <w:top w:val="dashed" w:sz="12" w:space="0" w:color="2B579A"/>
-              <w:left w:val="dashed" w:sz="12" w:space="0" w:color="2B579A"/>
-              <w:bottom w:val="dashed" w:sz="12" w:space="0" w:color="2B579A"/>
-              <w:right w:val="dashed" w:sz="12" w:space="0" w:color="2B579A"/>
+              <w:top w:val="single" w:sz="12" w:space="0" w:color="2B579A"/>
+              <w:left w:val="single" w:sz="18" w:space="0" w:color="2B579A"/>
+              <w:bottom w:val="single" w:sz="12" w:space="0" w:color="2B579A"/>
+              <w:right w:val="single" w:sz="12" w:space="0" w:color="2B579A"/>
             </w:tcBorders>
           </w:tcPr>
           <w:p>
@@ -2995,7 +3075,7 @@
                 <w:color w:val="2B579A"/>
                 <w:sz w:val="20"/>
               </w:rPr>
-              <w:t>📷 EVIDENCIA VISUAL: DASHBOARD DE CONFIGCAT CON GOBERNANZA DE FEATURE FLAGS</w:t>
+              <w:t>📷 EVIDENCIA VISUAL: CATÁLOGO COMERCIAL ELEVADO Y CONTROL DE FEATURE FLAGS</w:t>
             </w:r>
           </w:p>
           <w:p>
@@ -3009,7 +3089,7 @@
                 <w:color w:val="555555"/>
                 <w:sz w:val="18"/>
               </w:rPr>
-              <w:t>Guía de captura: Capture la pantalla del panel de control de ConfigCat mostrando el flag 'wishlist_enabled' configurado y los controles de segmentación o conmutación remota.</w:t>
+              <w:t>Guía de captura: Interfaz comercial profesional de VentasStore con diseño e-commerce moderno y control dual de Feature Flags (wishlist_enabled y pagos-express-v1).</w:t>
             </w:r>
           </w:p>
           <w:p>
@@ -3023,7 +3103,7 @@
                 <w:color w:val="333333"/>
                 <w:sz w:val="17"/>
               </w:rPr>
-              <w:t>Nombre del flag visible: wishlist_enabled.</w:t>
+              <w:t>Identidad comercial VentasStore Oficial con insignias de garantía y despacho.</w:t>
             </w:r>
           </w:p>
           <w:p>
@@ -3037,7 +3117,7 @@
                 <w:color w:val="333333"/>
                 <w:sz w:val="17"/>
               </w:rPr>
-              <w:t>SDK Key vinculada al entorno productivo.</w:t>
+              <w:t>Panel de control de Feature Flags con sincronización ConfigCat Cloud.</w:t>
             </w:r>
           </w:p>
           <w:p>
@@ -3051,7 +3131,7 @@
                 <w:color w:val="333333"/>
                 <w:sz w:val="17"/>
               </w:rPr>
-              <w:t>Estado del toggle (ON/OFF o porcentaje de rollout).</w:t>
+              <w:t>Botones interactivos de '❤️ Guardar' y '⚡ 1-Clic' en tarjetas de productos.</w:t>
             </w:r>
           </w:p>
           <w:p>
@@ -3065,22 +3145,62 @@
                 <w:color w:val="333333"/>
                 <w:sz w:val="17"/>
               </w:rPr>
-              <w:t>Historial de auditoría de cambios en ConfigCat.</w:t>
+              <w:t>Footer corporativo con categorías y sellos de seguridad de pagos.</w:t>
             </w:r>
           </w:p>
           <w:p>
             <w:pPr>
-              <w:spacing w:before="280" w:after="280"/>
+              <w:spacing w:before="200" w:after="80"/>
+              <w:jc w:val="center"/>
+            </w:pPr>
+            <w:r>
+              <w:drawing>
+                <wp:inline xmlns:a="http://schemas.openxmlformats.org/drawingml/2006/main" xmlns:pic="http://schemas.openxmlformats.org/drawingml/2006/picture">
+                  <wp:extent cx="5394960" cy="3709035"/>
+                  <wp:docPr id="3" name="Picture 3"/>
+                  <wp:cNvGraphicFramePr>
+                    <a:graphicFrameLocks noChangeAspect="1"/>
+                  </wp:cNvGraphicFramePr>
+                  <a:graphic>
+                    <a:graphicData uri="http://schemas.openxmlformats.org/drawingml/2006/picture">
+                      <pic:pic>
+                        <pic:nvPicPr>
+                          <pic:cNvPr id="0" name="captura_tienda_ecommerce.png"/>
+                          <pic:cNvPicPr/>
+                        </pic:nvPicPr>
+                        <pic:blipFill>
+                          <a:blip r:embed="rId11"/>
+                          <a:stretch>
+                            <a:fillRect/>
+                          </a:stretch>
+                        </pic:blipFill>
+                        <pic:spPr>
+                          <a:xfrm>
+                            <a:off x="0" y="0"/>
+                            <a:ext cx="5394960" cy="3709035"/>
+                          </a:xfrm>
+                          <a:prstGeom prst="rect"/>
+                        </pic:spPr>
+                      </pic:pic>
+                    </a:graphicData>
+                  </a:graphic>
+                </wp:inline>
+              </w:drawing>
+            </w:r>
+          </w:p>
+          <w:p>
+            <w:pPr>
+              <w:spacing w:before="40" w:after="120"/>
               <w:jc w:val="center"/>
             </w:pPr>
             <w:r>
               <w:rPr>
                 <w:rFonts w:ascii="Arial" w:hAnsi="Arial"/>
-                <w:b/>
-                <w:color w:val="888888"/>
-                <w:sz w:val="19"/>
+                <w:i/>
+                <w:color w:val="666666"/>
+                <w:sz w:val="17"/>
               </w:rPr>
-              <w:t>[ PEGUE AQUÍ LA CAPTURA DE PANTALLA EN ALTA DEFINICIÓN (100% NÍTIDA) ]</w:t>
+              <w:t>Figura: Evidencia visual de catálogo comercial elevado y control de feature flags capturada en alta resolución.</w:t>
             </w:r>
           </w:p>
         </w:tc>

</xml_diff>